<commit_message>
add contacts and applications
</commit_message>
<xml_diff>
--- a/resumes/Nick_Myers_Resume_Base.docx
+++ b/resumes/Nick_Myers_Resume_Base.docx
@@ -56,7 +56,7 @@
     <w:p>
       <w:pPr>
         <w:shd w:val="clear" w:color="auto" w:fill="FFFFFF"/>
-        <w:spacing w:before="100" w:after="100" w:line="240" w:lineRule="auto"/>
+        <w:spacing w:line="240" w:lineRule="auto"/>
         <w:ind w:right="-720" w:hanging="720"/>
         <w:jc w:val="right"/>
         <w:rPr>
@@ -65,16 +65,6 @@
           <w:szCs w:val="20"/>
           <w:u w:val="single"/>
         </w:rPr>
-        <w:sectPr>
-          <w:pgSz w:w="12240" w:h="15840"/>
-          <w:pgMar w:top="1440" w:right="1440" w:bottom="1440" w:left="1440" w:header="0" w:footer="0" w:gutter="0"/>
-          <w:pgNumType w:start="1"/>
-          <w:cols w:num="2" w:space="720" w:equalWidth="0">
-            <w:col w:w="4320" w:space="720"/>
-            <w:col w:w="4320" w:space="0"/>
-          </w:cols>
-          <w:docGrid w:linePitch="299"/>
-        </w:sectPr>
       </w:pPr>
       <w:r>
         <w:rPr>
@@ -102,7 +92,85 @@
           <w:u w:val="single"/>
         </w:rPr>
         <w:br/>
-        <w:t>nmyers@critable.com</w:t>
+      </w:r>
+      <w:hyperlink r:id="rId6" w:history="1">
+        <w:r>
+          <w:rPr>
+            <w:rStyle w:val="Hyperlink"/>
+            <w:sz w:val="20"/>
+            <w:szCs w:val="20"/>
+          </w:rPr>
+          <w:t>nmyers@critable.com</w:t>
+        </w:r>
+      </w:hyperlink>
+    </w:p>
+    <w:p>
+      <w:pPr>
+        <w:shd w:val="clear" w:color="auto" w:fill="FFFFFF"/>
+        <w:spacing w:line="240" w:lineRule="auto"/>
+        <w:ind w:right="-720" w:hanging="720"/>
+        <w:jc w:val="right"/>
+        <w:rPr>
+          <w:color w:val="1155CC"/>
+          <w:sz w:val="20"/>
+          <w:szCs w:val="20"/>
+          <w:u w:val="single"/>
+        </w:rPr>
+      </w:pPr>
+      <w:r>
+        <w:rPr>
+          <w:color w:val="1155CC"/>
+          <w:sz w:val="20"/>
+          <w:szCs w:val="20"/>
+          <w:u w:val="single"/>
+        </w:rPr>
+        <w:t>360-831-3070</w:t>
+      </w:r>
+    </w:p>
+    <w:p>
+      <w:pPr>
+        <w:shd w:val="clear" w:color="auto" w:fill="FFFFFF"/>
+        <w:spacing w:before="100" w:after="100" w:line="240" w:lineRule="auto"/>
+        <w:ind w:right="-720" w:hanging="720"/>
+        <w:jc w:val="right"/>
+        <w:rPr>
+          <w:color w:val="1155CC"/>
+          <w:sz w:val="20"/>
+          <w:szCs w:val="20"/>
+          <w:u w:val="single"/>
+        </w:rPr>
+      </w:pPr>
+    </w:p>
+    <w:p>
+      <w:pPr>
+        <w:shd w:val="clear" w:color="auto" w:fill="FFFFFF"/>
+        <w:spacing w:before="100" w:after="100" w:line="240" w:lineRule="auto"/>
+        <w:ind w:right="-720" w:hanging="720"/>
+        <w:rPr>
+          <w:color w:val="1155CC"/>
+          <w:sz w:val="20"/>
+          <w:szCs w:val="20"/>
+          <w:u w:val="single"/>
+        </w:rPr>
+        <w:sectPr>
+          <w:pgSz w:w="12240" w:h="15840"/>
+          <w:pgMar w:top="1440" w:right="1440" w:bottom="1440" w:left="1440" w:header="0" w:footer="0" w:gutter="0"/>
+          <w:pgNumType w:start="1"/>
+          <w:cols w:num="2" w:space="720" w:equalWidth="0">
+            <w:col w:w="4320" w:space="720"/>
+            <w:col w:w="4320" w:space="0"/>
+          </w:cols>
+          <w:docGrid w:linePitch="299"/>
+        </w:sectPr>
+      </w:pPr>
+      <w:r>
+        <w:rPr>
+          <w:color w:val="1155CC"/>
+          <w:sz w:val="20"/>
+          <w:szCs w:val="20"/>
+          <w:u w:val="single"/>
+        </w:rPr>
+        <w:t>360</w:t>
       </w:r>
     </w:p>
     <w:p>
@@ -770,6 +838,7 @@
           <w:sz w:val="20"/>
           <w:szCs w:val="20"/>
         </w:rPr>
+        <w:lastRenderedPageBreak/>
         <w:t xml:space="preserve">Improved reliability of e-commerce integrations by enhancing </w:t>
       </w:r>
       <w:proofErr w:type="spellStart"/>
@@ -808,7 +877,6 @@
           <w:sz w:val="20"/>
           <w:szCs w:val="20"/>
         </w:rPr>
-        <w:lastRenderedPageBreak/>
         <w:t xml:space="preserve">Designed and implemented a reusable component library aligned with client UI/UX requirements </w:t>
       </w:r>
     </w:p>
@@ -2714,6 +2782,29 @@
       <w:szCs w:val="30"/>
     </w:rPr>
   </w:style>
+  <w:style w:type="character" w:styleId="Hyperlink">
+    <w:name w:val="Hyperlink"/>
+    <w:basedOn w:val="DefaultParagraphFont"/>
+    <w:uiPriority w:val="99"/>
+    <w:unhideWhenUsed/>
+    <w:rsid w:val="00EA6A85"/>
+    <w:rPr>
+      <w:color w:val="0000FF" w:themeColor="hyperlink"/>
+      <w:u w:val="single"/>
+    </w:rPr>
+  </w:style>
+  <w:style w:type="character" w:styleId="UnresolvedMention">
+    <w:name w:val="Unresolved Mention"/>
+    <w:basedOn w:val="DefaultParagraphFont"/>
+    <w:uiPriority w:val="99"/>
+    <w:semiHidden/>
+    <w:unhideWhenUsed/>
+    <w:rsid w:val="00EA6A85"/>
+    <w:rPr>
+      <w:color w:val="605E5C"/>
+      <w:shd w:val="clear" w:color="auto" w:fill="E1DFDD"/>
+    </w:rPr>
+  </w:style>
 </w:styles>
 </file>
 

</xml_diff>